<commit_message>
docs(report): plain objective numbering, colon labels, architecture placement
Objectives are numbered 1 to 6 rather than O1 to O6, the outcomes in
Chapter 9 that answer them are numbered to match, and the four prose
references were renumbered. The lead-in sentence that sat alone as an
indented one-line paragraph is folded into the paragraph above it.

Every topic label ends in a colon rather than a full stop: 214 labels
across all nine chapters and the back matter. Eight labels that already
held an internal colon were reworded instead of gaining a second one.

The System Architecture figure filled the whole text block, stranding
its heading and paragraph on the previous page; scaling it to 0.76 puts
all three on one page with the four-layer discussion underneath.

110 pages, no undefined references, no overfull boxes above 5pt, no
stranded headings.

Co-Authored-By: Claude Opus 5 <noreply@anthropic.com>
</commit_message>
<xml_diff>
--- a/SETU/docs/Report/SETU_Project_Phase-II_Report.docx
+++ b/SETU/docs/Report/SETU_Project_Phase-II_Report.docx
@@ -2920,15 +2920,13 @@
         <w:t xml:space="preserve"> </w:t>
       </w:r>
       <w:r>
-        <w:t xml:space="preserve">non-specialist can actually use.</w:t>
-      </w:r>
-    </w:p>
-    <w:p>
-      <w:pPr>
-        <w:pStyle w:val="BodyText"/>
-      </w:pPr>
-      <w:r>
-        <w:t xml:space="preserve">Stated as measurable targets, the objectives are:</w:t>
+        <w:t xml:space="preserve">non-specialist can actually use. Stated as measurable targets, the objectives</w:t>
+      </w:r>
+      <w:r>
+        <w:t xml:space="preserve"> </w:t>
+      </w:r>
+      <w:r>
+        <w:t xml:space="preserve">are as follows.</w:t>
       </w:r>
     </w:p>
     <w:p>
@@ -2943,7 +2941,7 @@
           <w:bCs/>
           <w:b/>
         </w:rPr>
-        <w:t xml:space="preserve">Quality.</w:t>
+        <w:t xml:space="preserve">Quality:</w:t>
       </w:r>
       <w:r>
         <w:t xml:space="preserve"> </w:t>
@@ -3030,7 +3028,7 @@
           <w:bCs/>
           <w:b/>
         </w:rPr>
-        <w:t xml:space="preserve">Latency.</w:t>
+        <w:t xml:space="preserve">Latency:</w:t>
       </w:r>
       <w:r>
         <w:t xml:space="preserve"> </w:t>
@@ -3057,7 +3055,7 @@
           <w:bCs/>
           <w:b/>
         </w:rPr>
-        <w:t xml:space="preserve">Size.</w:t>
+        <w:t xml:space="preserve">Size:</w:t>
       </w:r>
       <w:r>
         <w:t xml:space="preserve"> </w:t>
@@ -3084,7 +3082,7 @@
           <w:bCs/>
           <w:b/>
         </w:rPr>
-        <w:t xml:space="preserve">Offline operation.</w:t>
+        <w:t xml:space="preserve">Offline operation:</w:t>
       </w:r>
       <w:r>
         <w:t xml:space="preserve"> </w:t>
@@ -3111,7 +3109,7 @@
           <w:bCs/>
           <w:b/>
         </w:rPr>
-        <w:t xml:space="preserve">Empirical finding.</w:t>
+        <w:t xml:space="preserve">Empirical finding:</w:t>
       </w:r>
       <w:r>
         <w:t xml:space="preserve"> </w:t>
@@ -3150,7 +3148,7 @@
           <w:bCs/>
           <w:b/>
         </w:rPr>
-        <w:t xml:space="preserve">Coverage and extensibility.</w:t>
+        <w:t xml:space="preserve">Coverage and extensibility:</w:t>
       </w:r>
       <w:r>
         <w:t xml:space="preserve"> </w:t>
@@ -3182,13 +3180,13 @@
         <w:pStyle w:val="FirstParagraph"/>
       </w:pPr>
       <w:r>
-        <w:t xml:space="preserve">Objectives O2, O3 and O4 are met by every trained direction without exception.</w:t>
-      </w:r>
-      <w:r>
-        <w:t xml:space="preserve"> </w:t>
-      </w:r>
-      <w:r>
-        <w:t xml:space="preserve">Objective O1 is met by 14 of 22 directions; the remaining eight fall between</w:t>
+        <w:t xml:space="preserve">Objectives 2, 3 and 4 are met by every trained direction without exception.</w:t>
+      </w:r>
+      <w:r>
+        <w:t xml:space="preserve"> </w:t>
+      </w:r>
+      <w:r>
+        <w:t xml:space="preserve">Objective 1 is met by 14 of 22 directions; the remaining eight fall between</w:t>
       </w:r>
       <w:r>
         <w:t xml:space="preserve"> </w:t>
@@ -3208,13 +3206,13 @@
         <w:t xml:space="preserve"> </w:t>
       </w:r>
       <w:r>
-        <w:t xml:space="preserve">analyses why. Objective O5</w:t>
-      </w:r>
-      <w:r>
-        <w:t xml:space="preserve"> </w:t>
-      </w:r>
-      <w:r>
-        <w:t xml:space="preserve">produced a refutation of the project’s own founding hypothesis. Objective O6 is</w:t>
+        <w:t xml:space="preserve">analyses why. Objective 5</w:t>
+      </w:r>
+      <w:r>
+        <w:t xml:space="preserve"> </w:t>
+      </w:r>
+      <w:r>
+        <w:t xml:space="preserve">produced a refutation of the project’s own founding hypothesis. Objective 6 is</w:t>
       </w:r>
       <w:r>
         <w:t xml:space="preserve"> </w:t>
@@ -3463,7 +3461,7 @@
           <w:bCs/>
           <w:b/>
         </w:rPr>
-        <w:t xml:space="preserve">Methodology.</w:t>
+        <w:t xml:space="preserve">Methodology:</w:t>
       </w:r>
       <w:r>
         <w:t xml:space="preserve"> </w:t>
@@ -3517,7 +3515,7 @@
           <w:bCs/>
           <w:b/>
         </w:rPr>
-        <w:t xml:space="preserve">Languages delivered.</w:t>
+        <w:t xml:space="preserve">Languages delivered:</w:t>
       </w:r>
       <w:r>
         <w:t xml:space="preserve"> </w:t>
@@ -3565,7 +3563,7 @@
           <w:bCs/>
           <w:b/>
         </w:rPr>
-        <w:t xml:space="preserve">Assumptions.</w:t>
+        <w:t xml:space="preserve">Assumptions:</w:t>
       </w:r>
       <w:r>
         <w:t xml:space="preserve"> </w:t>
@@ -3630,7 +3628,7 @@
           <w:bCs/>
           <w:b/>
         </w:rPr>
-        <w:t xml:space="preserve">Limitations, stated up front.</w:t>
+        <w:t xml:space="preserve">Limitations, stated up front:</w:t>
       </w:r>
       <w:r>
         <w:t xml:space="preserve"> </w:t>
@@ -3704,7 +3702,7 @@
           <w:bCs/>
           <w:b/>
         </w:rPr>
-        <w:t xml:space="preserve">Direct applications.</w:t>
+        <w:t xml:space="preserve">Direct applications:</w:t>
       </w:r>
       <w:r>
         <w:t xml:space="preserve"> </w:t>
@@ -3770,7 +3768,7 @@
           <w:bCs/>
           <w:b/>
         </w:rPr>
-        <w:t xml:space="preserve">Indirect contributions.</w:t>
+        <w:t xml:space="preserve">Indirect contributions:</w:t>
       </w:r>
       <w:r>
         <w:t xml:space="preserve"> </w:t>
@@ -8268,7 +8266,7 @@
           <w:bCs/>
           <w:b/>
         </w:rPr>
-        <w:t xml:space="preserve">Cloud dependency.</w:t>
+        <w:t xml:space="preserve">Cloud dependency:</w:t>
       </w:r>
       <w:r>
         <w:t xml:space="preserve"> </w:t>
@@ -8322,7 +8320,7 @@
           <w:bCs/>
           <w:b/>
         </w:rPr>
-        <w:t xml:space="preserve">High compute requirements.</w:t>
+        <w:t xml:space="preserve">High compute requirements:</w:t>
       </w:r>
       <w:r>
         <w:t xml:space="preserve"> </w:t>
@@ -8370,7 +8368,7 @@
           <w:bCs/>
           <w:b/>
         </w:rPr>
-        <w:t xml:space="preserve">Error propagation in cascaded pipelines.</w:t>
+        <w:t xml:space="preserve">Error propagation in cascaded pipelines:</w:t>
       </w:r>
       <w:r>
         <w:t xml:space="preserve"> </w:t>
@@ -8412,7 +8410,7 @@
           <w:bCs/>
           <w:b/>
         </w:rPr>
-        <w:t xml:space="preserve">Narrow language coverage.</w:t>
+        <w:t xml:space="preserve">Narrow language coverage:</w:t>
       </w:r>
       <w:r>
         <w:t xml:space="preserve"> </w:t>
@@ -8454,7 +8452,7 @@
           <w:bCs/>
           <w:b/>
         </w:rPr>
-        <w:t xml:space="preserve">Data scarcity for low-resource languages.</w:t>
+        <w:t xml:space="preserve">Data scarcity for low-resource languages:</w:t>
       </w:r>
       <w:r>
         <w:t xml:space="preserve"> </w:t>
@@ -8623,7 +8621,7 @@
           <w:bCs/>
           <w:b/>
         </w:rPr>
-        <w:t xml:space="preserve">Corpus quality.</w:t>
+        <w:t xml:space="preserve">Corpus quality:</w:t>
       </w:r>
       <w:r>
         <w:t xml:space="preserve"> </w:t>
@@ -8671,7 +8669,7 @@
           <w:bCs/>
           <w:b/>
         </w:rPr>
-        <w:t xml:space="preserve">Choice of training signal.</w:t>
+        <w:t xml:space="preserve">Choice of training signal:</w:t>
       </w:r>
       <w:r>
         <w:t xml:space="preserve"> </w:t>
@@ -8719,7 +8717,7 @@
           <w:bCs/>
           <w:b/>
         </w:rPr>
-        <w:t xml:space="preserve">Training stability.</w:t>
+        <w:t xml:space="preserve">Training stability:</w:t>
       </w:r>
       <w:r>
         <w:t xml:space="preserve"> </w:t>
@@ -8767,7 +8765,7 @@
           <w:bCs/>
           <w:b/>
         </w:rPr>
-        <w:t xml:space="preserve">Deployment footprint.</w:t>
+        <w:t xml:space="preserve">Deployment footprint:</w:t>
       </w:r>
       <w:r>
         <w:t xml:space="preserve"> </w:t>
@@ -8815,7 +8813,7 @@
           <w:bCs/>
           <w:b/>
         </w:rPr>
-        <w:t xml:space="preserve">Indic-to-Indic coverage.</w:t>
+        <w:t xml:space="preserve">Indic-to-Indic coverage:</w:t>
       </w:r>
       <w:r>
         <w:t xml:space="preserve"> </w:t>
@@ -8899,7 +8897,7 @@
           <w:bCs/>
           <w:b/>
         </w:rPr>
-        <w:t xml:space="preserve">Extensibility.</w:t>
+        <w:t xml:space="preserve">Extensibility:</w:t>
       </w:r>
       <w:r>
         <w:t xml:space="preserve"> </w:t>
@@ -8981,7 +8979,7 @@
           <w:bCs/>
           <w:b/>
         </w:rPr>
-        <w:t xml:space="preserve">Stage 1: Teacher distillation.</w:t>
+        <w:t xml:space="preserve">Stage 1, teacher distillation:</w:t>
       </w:r>
       <w:r>
         <w:t xml:space="preserve"> </w:t>
@@ -9029,7 +9027,7 @@
           <w:bCs/>
           <w:b/>
         </w:rPr>
-        <w:t xml:space="preserve">Stage 2: Student training.</w:t>
+        <w:t xml:space="preserve">Stage 2, student training:</w:t>
       </w:r>
       <w:r>
         <w:t xml:space="preserve"> </w:t>
@@ -9103,7 +9101,7 @@
           <w:bCs/>
           <w:b/>
         </w:rPr>
-        <w:t xml:space="preserve">Stage 3: Quantisation.</w:t>
+        <w:t xml:space="preserve">Stage 3, quantisation:</w:t>
       </w:r>
       <w:r>
         <w:t xml:space="preserve"> </w:t>
@@ -9139,7 +9137,7 @@
           <w:bCs/>
           <w:b/>
         </w:rPr>
-        <w:t xml:space="preserve">Stage 4: Offline serving.</w:t>
+        <w:t xml:space="preserve">Stage 4, offline serving:</w:t>
       </w:r>
       <w:r>
         <w:t xml:space="preserve"> </w:t>
@@ -10423,7 +10421,7 @@
           <w:bCs/>
           <w:b/>
         </w:rPr>
-        <w:t xml:space="preserve">Transformers versus Torch (CVE-2025-32434).</w:t>
+        <w:t xml:space="preserve">Transformers versus Torch (CVE-2025-32434):</w:t>
       </w:r>
       <w:r>
         <w:t xml:space="preserve"> </w:t>
@@ -10513,7 +10511,7 @@
           <w:bCs/>
           <w:b/>
         </w:rPr>
-        <w:t xml:space="preserve">Torchvision ABI mismatch.</w:t>
+        <w:t xml:space="preserve">Torchvision ABI mismatch:</w:t>
       </w:r>
       <w:r>
         <w:t xml:space="preserve"> </w:t>
@@ -10594,7 +10592,7 @@
           <w:bCs/>
           <w:b/>
         </w:rPr>
-        <w:t xml:space="preserve">vGPU allocator crash.</w:t>
+        <w:t xml:space="preserve">vGPU allocator crash:</w:t>
       </w:r>
       <w:r>
         <w:t xml:space="preserve"> </w:t>
@@ -10675,7 +10673,7 @@
           <w:bCs/>
           <w:b/>
         </w:rPr>
-        <w:t xml:space="preserve">Resume re-clone bug.</w:t>
+        <w:t xml:space="preserve">Resume re-clone bug:</w:t>
       </w:r>
       <w:r>
         <w:t xml:space="preserve"> </w:t>
@@ -12348,7 +12346,7 @@
           <w:bCs/>
           <w:b/>
         </w:rPr>
-        <w:t xml:space="preserve">Python runtime.</w:t>
+        <w:t xml:space="preserve">Python runtime:</w:t>
       </w:r>
       <w:r>
         <w:t xml:space="preserve"> </w:t>
@@ -12375,7 +12373,7 @@
           <w:bCs/>
           <w:b/>
         </w:rPr>
-        <w:t xml:space="preserve">Transformers version.</w:t>
+        <w:t xml:space="preserve">Transformers version:</w:t>
       </w:r>
       <w:r>
         <w:t xml:space="preserve"> </w:t>
@@ -12432,7 +12430,7 @@
           <w:bCs/>
           <w:b/>
         </w:rPr>
-        <w:t xml:space="preserve">PyTorch and torchvision.</w:t>
+        <w:t xml:space="preserve">PyTorch and torchvision:</w:t>
       </w:r>
       <w:r>
         <w:t xml:space="preserve"> </w:t>
@@ -12468,7 +12466,7 @@
           <w:bCs/>
           <w:b/>
         </w:rPr>
-        <w:t xml:space="preserve">ONNX Runtime.</w:t>
+        <w:t xml:space="preserve">ONNX Runtime:</w:t>
       </w:r>
       <w:r>
         <w:t xml:space="preserve"> </w:t>
@@ -12495,7 +12493,7 @@
           <w:bCs/>
           <w:b/>
         </w:rPr>
-        <w:t xml:space="preserve">Training accelerator.</w:t>
+        <w:t xml:space="preserve">Training accelerator:</w:t>
       </w:r>
       <w:r>
         <w:t xml:space="preserve"> </w:t>
@@ -12522,7 +12520,7 @@
           <w:bCs/>
           <w:b/>
         </w:rPr>
-        <w:t xml:space="preserve">Storage per direction.</w:t>
+        <w:t xml:space="preserve">Storage per direction:</w:t>
       </w:r>
       <w:r>
         <w:t xml:space="preserve"> </w:t>
@@ -12549,7 +12547,7 @@
           <w:bCs/>
           <w:b/>
         </w:rPr>
-        <w:t xml:space="preserve">Node.js for the browser build.</w:t>
+        <w:t xml:space="preserve">Node.js for the browser build:</w:t>
       </w:r>
       <w:r>
         <w:t xml:space="preserve"> </w:t>
@@ -13643,7 +13641,7 @@
           <w:bCs/>
           <w:b/>
         </w:rPr>
-        <w:t xml:space="preserve">Script-qualified language codes.</w:t>
+        <w:t xml:space="preserve">Script-qualified language codes:</w:t>
       </w:r>
       <w:r>
         <w:t xml:space="preserve"> </w:t>
@@ -13703,7 +13701,7 @@
           <w:bCs/>
           <w:b/>
         </w:rPr>
-        <w:t xml:space="preserve">Joiner preservation.</w:t>
+        <w:t xml:space="preserve">Joiner preservation:</w:t>
       </w:r>
       <w:r>
         <w:t xml:space="preserve"> </w:t>
@@ -13736,7 +13734,7 @@
           <w:bCs/>
           <w:b/>
         </w:rPr>
-        <w:t xml:space="preserve">Script-fraction cleaning.</w:t>
+        <w:t xml:space="preserve">Script-fraction cleaning:</w:t>
       </w:r>
       <w:r>
         <w:t xml:space="preserve"> </w:t>
@@ -13769,7 +13767,7 @@
           <w:bCs/>
           <w:b/>
         </w:rPr>
-        <w:t xml:space="preserve">Held-out human references.</w:t>
+        <w:t xml:space="preserve">Held-out human references:</w:t>
       </w:r>
       <w:r>
         <w:t xml:space="preserve"> </w:t>
@@ -13822,7 +13820,7 @@
           <w:bCs/>
           <w:b/>
         </w:rPr>
-        <w:t xml:space="preserve">Reserved tokenizer tags.</w:t>
+        <w:t xml:space="preserve">Reserved tokenizer tags:</w:t>
       </w:r>
       <w:r>
         <w:t xml:space="preserve"> </w:t>
@@ -13861,7 +13859,7 @@
           <w:bCs/>
           <w:b/>
         </w:rPr>
-        <w:t xml:space="preserve">BLEU is not comparable across languages.</w:t>
+        <w:t xml:space="preserve">BLEU is not comparable across languages:</w:t>
       </w:r>
       <w:r>
         <w:t xml:space="preserve"> </w:t>
@@ -14040,7 +14038,7 @@
           <w:bCs/>
           <w:b/>
         </w:rPr>
-        <w:t xml:space="preserve">Scaffold (M0).</w:t>
+        <w:t xml:space="preserve">Scaffold (M0):</w:t>
       </w:r>
       <w:r>
         <w:t xml:space="preserve"> </w:t>
@@ -14077,7 +14075,7 @@
           <w:bCs/>
           <w:b/>
         </w:rPr>
-        <w:t xml:space="preserve">Data pipeline (M1).</w:t>
+        <w:t xml:space="preserve">Data pipeline (M1):</w:t>
       </w:r>
       <w:r>
         <w:t xml:space="preserve"> </w:t>
@@ -14126,7 +14124,7 @@
           <w:bCs/>
           <w:b/>
         </w:rPr>
-        <w:t xml:space="preserve">Teacher integration (M2).</w:t>
+        <w:t xml:space="preserve">Teacher integration (M2):</w:t>
       </w:r>
       <w:r>
         <w:t xml:space="preserve"> </w:t>
@@ -14163,7 +14161,7 @@
           <w:bCs/>
           <w:b/>
         </w:rPr>
-        <w:t xml:space="preserve">Preference generation (M3).</w:t>
+        <w:t xml:space="preserve">Preference generation (M3):</w:t>
       </w:r>
       <w:r>
         <w:t xml:space="preserve"> </w:t>
@@ -14268,7 +14266,7 @@
           <w:bCs/>
           <w:b/>
         </w:rPr>
-        <w:t xml:space="preserve">SFT and DPO training (M4).</w:t>
+        <w:t xml:space="preserve">SFT and DPO training (M4):</w:t>
       </w:r>
       <w:r>
         <w:t xml:space="preserve"> </w:t>
@@ -14305,7 +14303,7 @@
           <w:bCs/>
           <w:b/>
         </w:rPr>
-        <w:t xml:space="preserve">Quantisation and offline inference (M5).</w:t>
+        <w:t xml:space="preserve">Quantisation and offline inference (M5):</w:t>
       </w:r>
       <w:r>
         <w:t xml:space="preserve"> </w:t>
@@ -14342,7 +14340,7 @@
           <w:bCs/>
           <w:b/>
         </w:rPr>
-        <w:t xml:space="preserve">Interfaces (M6).</w:t>
+        <w:t xml:space="preserve">Interfaces (M6):</w:t>
       </w:r>
       <w:r>
         <w:t xml:space="preserve"> </w:t>
@@ -14379,7 +14377,7 @@
           <w:bCs/>
           <w:b/>
         </w:rPr>
-        <w:t xml:space="preserve">All-in-One KD (M7).</w:t>
+        <w:t xml:space="preserve">All-in-One KD (M7):</w:t>
       </w:r>
       <w:r>
         <w:t xml:space="preserve"> </w:t>
@@ -14416,7 +14414,7 @@
           <w:bCs/>
           <w:b/>
         </w:rPr>
-        <w:t xml:space="preserve">Elastic Weight Consolidation (M8).</w:t>
+        <w:t xml:space="preserve">Elastic Weight Consolidation (M8):</w:t>
       </w:r>
       <w:r>
         <w:t xml:space="preserve"> </w:t>
@@ -14453,7 +14451,7 @@
           <w:bCs/>
           <w:b/>
         </w:rPr>
-        <w:t xml:space="preserve">Hardening and delivery (M9).</w:t>
+        <w:t xml:space="preserve">Hardening and delivery (M9):</w:t>
       </w:r>
       <w:r>
         <w:t xml:space="preserve"> </w:t>
@@ -14513,7 +14511,7 @@
           <w:bCs/>
           <w:b/>
         </w:rPr>
-        <w:t xml:space="preserve">SeqKD baseline and head-to-head.</w:t>
+        <w:t xml:space="preserve">SeqKD baseline and head-to-head:</w:t>
       </w:r>
       <w:r>
         <w:t xml:space="preserve"> </w:t>
@@ -14579,7 +14577,7 @@
           <w:bCs/>
           <w:b/>
         </w:rPr>
-        <w:t xml:space="preserve">GPU campaign.</w:t>
+        <w:t xml:space="preserve">GPU campaign:</w:t>
       </w:r>
       <w:r>
         <w:t xml:space="preserve"> </w:t>
@@ -14616,7 +14614,7 @@
           <w:bCs/>
           <w:b/>
         </w:rPr>
-        <w:t xml:space="preserve">Collapse diagnosis and recovery.</w:t>
+        <w:t xml:space="preserve">Collapse diagnosis and recovery:</w:t>
       </w:r>
       <w:r>
         <w:t xml:space="preserve"> </w:t>
@@ -14653,7 +14651,7 @@
           <w:bCs/>
           <w:b/>
         </w:rPr>
-        <w:t xml:space="preserve">English-pivot routing.</w:t>
+        <w:t xml:space="preserve">English-pivot routing:</w:t>
       </w:r>
       <w:r>
         <w:t xml:space="preserve"> </w:t>
@@ -14690,7 +14688,7 @@
           <w:bCs/>
           <w:b/>
         </w:rPr>
-        <w:t xml:space="preserve">Frontend and release.</w:t>
+        <w:t xml:space="preserve">Frontend and release:</w:t>
       </w:r>
       <w:r>
         <w:t xml:space="preserve"> </w:t>
@@ -14727,7 +14725,7 @@
           <w:bCs/>
           <w:b/>
         </w:rPr>
-        <w:t xml:space="preserve">Report and paper.</w:t>
+        <w:t xml:space="preserve">Report and paper:</w:t>
       </w:r>
       <w:r>
         <w:t xml:space="preserve"> </w:t>
@@ -15457,7 +15455,7 @@
           <w:bCs/>
           <w:b/>
         </w:rPr>
-        <w:t xml:space="preserve">Literature survey and requirements (A).</w:t>
+        <w:t xml:space="preserve">Literature survey and requirements (A):</w:t>
       </w:r>
       <w:r>
         <w:t xml:space="preserve"> </w:t>
@@ -15599,7 +15597,7 @@
           <w:bCs/>
           <w:b/>
         </w:rPr>
-        <w:t xml:space="preserve">System design (B).</w:t>
+        <w:t xml:space="preserve">System design (B):</w:t>
       </w:r>
       <w:r>
         <w:t xml:space="preserve"> </w:t>
@@ -15741,7 +15739,7 @@
           <w:bCs/>
           <w:b/>
         </w:rPr>
-        <w:t xml:space="preserve">Pipeline implementation (C).</w:t>
+        <w:t xml:space="preserve">Pipeline implementation (C):</w:t>
       </w:r>
       <w:r>
         <w:t xml:space="preserve"> </w:t>
@@ -15883,7 +15881,7 @@
           <w:bCs/>
           <w:b/>
         </w:rPr>
-        <w:t xml:space="preserve">Corpus preparation (D).</w:t>
+        <w:t xml:space="preserve">Corpus preparation (D):</w:t>
       </w:r>
       <w:r>
         <w:t xml:space="preserve"> </w:t>
@@ -16025,7 +16023,7 @@
           <w:bCs/>
           <w:b/>
         </w:rPr>
-        <w:t xml:space="preserve">Teacher distillation (E).</w:t>
+        <w:t xml:space="preserve">Teacher distillation (E):</w:t>
       </w:r>
       <w:r>
         <w:t xml:space="preserve"> </w:t>
@@ -16167,7 +16165,7 @@
           <w:bCs/>
           <w:b/>
         </w:rPr>
-        <w:t xml:space="preserve">F, student training (SeqKD).</w:t>
+        <w:t xml:space="preserve">F, student training (SeqKD):</w:t>
       </w:r>
       <w:r>
         <w:t xml:space="preserve"> </w:t>
@@ -16309,7 +16307,7 @@
           <w:bCs/>
           <w:b/>
         </w:rPr>
-        <w:t xml:space="preserve">Collapse diagnosis &amp; retraining (G).</w:t>
+        <w:t xml:space="preserve">Collapse diagnosis &amp; retraining (G):</w:t>
       </w:r>
       <w:r>
         <w:t xml:space="preserve"> </w:t>
@@ -16451,7 +16449,7 @@
           <w:bCs/>
           <w:b/>
         </w:rPr>
-        <w:t xml:space="preserve">Quantisation &amp; ONNX export (H).</w:t>
+        <w:t xml:space="preserve">Quantisation &amp; ONNX export (H):</w:t>
       </w:r>
       <w:r>
         <w:t xml:space="preserve"> </w:t>
@@ -16593,7 +16591,7 @@
           <w:bCs/>
           <w:b/>
         </w:rPr>
-        <w:t xml:space="preserve">Interfaces &amp; pivot routing (I).</w:t>
+        <w:t xml:space="preserve">Interfaces &amp; pivot routing (I):</w:t>
       </w:r>
       <w:r>
         <w:t xml:space="preserve"> </w:t>
@@ -16735,7 +16733,7 @@
           <w:bCs/>
           <w:b/>
         </w:rPr>
-        <w:t xml:space="preserve">Evaluation &amp; scorecard (J).</w:t>
+        <w:t xml:space="preserve">Evaluation &amp; scorecard (J):</w:t>
       </w:r>
       <w:r>
         <w:t xml:space="preserve"> </w:t>
@@ -16877,7 +16875,7 @@
           <w:bCs/>
           <w:b/>
         </w:rPr>
-        <w:t xml:space="preserve">Documentation &amp; report (K).</w:t>
+        <w:t xml:space="preserve">Documentation &amp; report (K):</w:t>
       </w:r>
       <w:r>
         <w:t xml:space="preserve"> </w:t>
@@ -17621,7 +17619,7 @@
           <w:bCs/>
           <w:b/>
         </w:rPr>
-        <w:t xml:space="preserve">Gated access to the teacher checkpoints and the BPCC corpus.</w:t>
+        <w:t xml:space="preserve">Gated access to the teacher checkpoints and the BPCC corpus:</w:t>
       </w:r>
       <w:r>
         <w:t xml:space="preserve"> </w:t>
@@ -17658,7 +17656,7 @@
           <w:bCs/>
           <w:b/>
         </w:rPr>
-        <w:t xml:space="preserve">No GPU available locally.</w:t>
+        <w:t xml:space="preserve">No GPU available locally:</w:t>
       </w:r>
       <w:r>
         <w:t xml:space="preserve"> </w:t>
@@ -17695,7 +17693,7 @@
           <w:bCs/>
           <w:b/>
         </w:rPr>
-        <w:t xml:space="preserve">Student fails to reach the quality target.</w:t>
+        <w:t xml:space="preserve">Student fails to reach the quality target:</w:t>
       </w:r>
       <w:r>
         <w:t xml:space="preserve"> </w:t>
@@ -17732,7 +17730,7 @@
           <w:bCs/>
           <w:b/>
         </w:rPr>
-        <w:t xml:space="preserve">Training instability or divergence.</w:t>
+        <w:t xml:space="preserve">Training instability or divergence:</w:t>
       </w:r>
       <w:r>
         <w:t xml:space="preserve"> </w:t>
@@ -17777,7 +17775,7 @@
           <w:bCs/>
           <w:b/>
         </w:rPr>
-        <w:t xml:space="preserve">Cloud session time limits kill long runs.</w:t>
+        <w:t xml:space="preserve">Cloud session time limits kill long runs:</w:t>
       </w:r>
       <w:r>
         <w:t xml:space="preserve"> </w:t>
@@ -17814,7 +17812,7 @@
           <w:bCs/>
           <w:b/>
         </w:rPr>
-        <w:t xml:space="preserve">Quantised model exceeds the size budget.</w:t>
+        <w:t xml:space="preserve">Quantised model exceeds the size budget:</w:t>
       </w:r>
       <w:r>
         <w:t xml:space="preserve"> </w:t>
@@ -17851,7 +17849,7 @@
           <w:bCs/>
           <w:b/>
         </w:rPr>
-        <w:t xml:space="preserve">Inference too slow on CPU.</w:t>
+        <w:t xml:space="preserve">Inference too slow on CPU:</w:t>
       </w:r>
       <w:r>
         <w:t xml:space="preserve"> </w:t>
@@ -17888,7 +17886,7 @@
           <w:bCs/>
           <w:b/>
         </w:rPr>
-        <w:t xml:space="preserve">Dependency and environment conflicts.</w:t>
+        <w:t xml:space="preserve">Dependency and environment conflicts:</w:t>
       </w:r>
       <w:r>
         <w:t xml:space="preserve"> </w:t>
@@ -17936,7 +17934,7 @@
           <w:bCs/>
           <w:b/>
         </w:rPr>
-        <w:t xml:space="preserve">Insufficient corpus for low-resource languages.</w:t>
+        <w:t xml:space="preserve">Insufficient corpus for low-resource languages:</w:t>
       </w:r>
       <w:r>
         <w:t xml:space="preserve"> </w:t>
@@ -18602,7 +18600,7 @@
           <w:bCs/>
           <w:b/>
         </w:rPr>
-        <w:t xml:space="preserve">One direction, one model.</w:t>
+        <w:t xml:space="preserve">One direction, one model:</w:t>
       </w:r>
       <w:r>
         <w:t xml:space="preserve"> </w:t>
@@ -18687,7 +18685,7 @@
           <w:bCs/>
           <w:b/>
         </w:rPr>
-        <w:t xml:space="preserve">The teacher lives behind a wall.</w:t>
+        <w:t xml:space="preserve">The teacher lives behind a wall:</w:t>
       </w:r>
       <w:r>
         <w:t xml:space="preserve"> </w:t>
@@ -18771,7 +18769,7 @@
           <w:bCs/>
           <w:b/>
         </w:rPr>
-        <w:t xml:space="preserve">Configuration, not code.</w:t>
+        <w:t xml:space="preserve">Configuration, not code:</w:t>
       </w:r>
       <w:r>
         <w:t xml:space="preserve"> </w:t>
@@ -18813,7 +18811,7 @@
           <w:bCs/>
           <w:b/>
         </w:rPr>
-        <w:t xml:space="preserve">Fail loudly, never silently.</w:t>
+        <w:t xml:space="preserve">Fail loudly, never silently:</w:t>
       </w:r>
       <w:r>
         <w:t xml:space="preserve"> </w:t>
@@ -18888,7 +18886,7 @@
           <w:bCs/>
           <w:b/>
         </w:rPr>
-        <w:t xml:space="preserve">Resumability by construction.</w:t>
+        <w:t xml:space="preserve">Resumability by construction:</w:t>
       </w:r>
       <w:r>
         <w:t xml:space="preserve"> </w:t>
@@ -19355,7 +19353,7 @@
           <w:bCs/>
           <w:b/>
         </w:rPr>
-        <w:t xml:space="preserve">PAD masking.</w:t>
+        <w:t xml:space="preserve">PAD masking:</w:t>
       </w:r>
       <w:r>
         <w:t xml:space="preserve"> </w:t>
@@ -19414,7 +19412,7 @@
           <w:bCs/>
           <w:b/>
         </w:rPr>
-        <w:t xml:space="preserve">Linear warmup and decay.</w:t>
+        <w:t xml:space="preserve">Linear warmup and decay:</w:t>
       </w:r>
       <w:r>
         <w:t xml:space="preserve"> </w:t>
@@ -19453,7 +19451,7 @@
           <w:bCs/>
           <w:b/>
         </w:rPr>
-        <w:t xml:space="preserve">Label smoothing (0.1) and dropout (0.2).</w:t>
+        <w:t xml:space="preserve">Label smoothing (0.1) and dropout (0.2):</w:t>
       </w:r>
       <w:r>
         <w:t xml:space="preserve"> </w:t>
@@ -19480,7 +19478,7 @@
           <w:bCs/>
           <w:b/>
         </w:rPr>
-        <w:t xml:space="preserve">Gradient-norm clipping at 1.0.</w:t>
+        <w:t xml:space="preserve">Gradient-norm clipping at 1.0:</w:t>
       </w:r>
       <w:r>
         <w:t xml:space="preserve"> </w:t>
@@ -19525,7 +19523,7 @@
           <w:bCs/>
           <w:b/>
         </w:rPr>
-        <w:t xml:space="preserve">Generation safeguards.</w:t>
+        <w:t xml:space="preserve">Generation safeguards:</w:t>
       </w:r>
       <w:r>
         <w:t xml:space="preserve"> </w:t>
@@ -20494,7 +20492,7 @@
           <w:bCs/>
           <w:b/>
         </w:rPr>
-        <w:t xml:space="preserve">REST: translate.</w:t>
+        <w:t xml:space="preserve">REST translate endpoint:</w:t>
       </w:r>
       <w:r>
         <w:t xml:space="preserve"> </w:t>
@@ -20566,7 +20564,7 @@
           <w:bCs/>
           <w:b/>
         </w:rPr>
-        <w:t xml:space="preserve">REST: languages.</w:t>
+        <w:t xml:space="preserve">REST languages endpoint:</w:t>
       </w:r>
       <w:r>
         <w:t xml:space="preserve"> </w:t>
@@ -20613,7 +20611,7 @@
           <w:bCs/>
           <w:b/>
         </w:rPr>
-        <w:t xml:space="preserve">REST: models.</w:t>
+        <w:t xml:space="preserve">REST models endpoint:</w:t>
       </w:r>
       <w:r>
         <w:t xml:space="preserve"> </w:t>
@@ -20666,7 +20664,7 @@
           <w:bCs/>
           <w:b/>
         </w:rPr>
-        <w:t xml:space="preserve">REST: health.</w:t>
+        <w:t xml:space="preserve">REST health endpoint:</w:t>
       </w:r>
       <w:r>
         <w:t xml:space="preserve"> </w:t>
@@ -20719,7 +20717,7 @@
           <w:bCs/>
           <w:b/>
         </w:rPr>
-        <w:t xml:space="preserve">CLI.</w:t>
+        <w:t xml:space="preserve">CLI:</w:t>
       </w:r>
       <w:r>
         <w:t xml:space="preserve"> </w:t>
@@ -20782,7 +20780,7 @@
           <w:bCs/>
           <w:b/>
         </w:rPr>
-        <w:t xml:space="preserve">Web client.</w:t>
+        <w:t xml:space="preserve">Web client:</w:t>
       </w:r>
       <w:r>
         <w:t xml:space="preserve"> </w:t>
@@ -20803,7 +20801,7 @@
           <w:bCs/>
           <w:b/>
         </w:rPr>
-        <w:t xml:space="preserve">Offline PWA.</w:t>
+        <w:t xml:space="preserve">Offline PWA:</w:t>
       </w:r>
       <w:r>
         <w:t xml:space="preserve"> </w:t>
@@ -20824,7 +20822,7 @@
           <w:bCs/>
           <w:b/>
         </w:rPr>
-        <w:t xml:space="preserve">Mobile SDK.</w:t>
+        <w:t xml:space="preserve">Mobile SDK:</w:t>
       </w:r>
       <w:r>
         <w:t xml:space="preserve"> </w:t>
@@ -20860,7 +20858,7 @@
           <w:bCs/>
           <w:b/>
         </w:rPr>
-        <w:t xml:space="preserve">Training CLI.</w:t>
+        <w:t xml:space="preserve">Training CLI:</w:t>
       </w:r>
       <w:r>
         <w:t xml:space="preserve"> </w:t>
@@ -26487,7 +26485,7 @@
           <w:bCs/>
           <w:b/>
         </w:rPr>
-        <w:t xml:space="preserve">Configuration over code.</w:t>
+        <w:t xml:space="preserve">Configuration over code:</w:t>
       </w:r>
       <w:r>
         <w:t xml:space="preserve"> </w:t>
@@ -26529,7 +26527,7 @@
           <w:bCs/>
           <w:b/>
         </w:rPr>
-        <w:t xml:space="preserve">One boundary for the teacher.</w:t>
+        <w:t xml:space="preserve">One boundary for the teacher:</w:t>
       </w:r>
       <w:r>
         <w:t xml:space="preserve"> </w:t>
@@ -26553,7 +26551,7 @@
           <w:bCs/>
           <w:b/>
         </w:rPr>
-        <w:t xml:space="preserve">Test-first for anything subtle.</w:t>
+        <w:t xml:space="preserve">Test-first for anything subtle:</w:t>
       </w:r>
       <w:r>
         <w:t xml:space="preserve"> </w:t>
@@ -34697,7 +34695,7 @@
           <w:bCs/>
           <w:b/>
         </w:rPr>
-        <w:t xml:space="preserve">Progressive INT8 then INT4 quantisation.</w:t>
+        <w:t xml:space="preserve">Progressive INT8 then INT4 quantisation:</w:t>
       </w:r>
       <w:r>
         <w:t xml:space="preserve"> </w:t>
@@ -34782,7 +34780,7 @@
           <w:bCs/>
           <w:b/>
         </w:rPr>
-        <w:t xml:space="preserve">Greedy decoding at deployment.</w:t>
+        <w:t xml:space="preserve">Greedy decoding at deployment:</w:t>
       </w:r>
       <w:r>
         <w:t xml:space="preserve"> </w:t>
@@ -34833,7 +34831,7 @@
           <w:bCs/>
           <w:b/>
         </w:rPr>
-        <w:t xml:space="preserve">Corpus streaming.</w:t>
+        <w:t xml:space="preserve">Corpus streaming:</w:t>
       </w:r>
       <w:r>
         <w:t xml:space="preserve"> </w:t>
@@ -34870,7 +34868,7 @@
           <w:bCs/>
           <w:b/>
         </w:rPr>
-        <w:t xml:space="preserve">Greedy teacher decoding for distillation.</w:t>
+        <w:t xml:space="preserve">Greedy teacher decoding for distillation:</w:t>
       </w:r>
       <w:r>
         <w:t xml:space="preserve"> </w:t>
@@ -34942,7 +34940,7 @@
           <w:bCs/>
           <w:b/>
         </w:rPr>
-        <w:t xml:space="preserve">).</w:t>
+        <w:t xml:space="preserve">):</w:t>
       </w:r>
       <w:r>
         <w:t xml:space="preserve"> </w:t>
@@ -34979,7 +34977,7 @@
           <w:bCs/>
           <w:b/>
         </w:rPr>
-        <w:t xml:space="preserve">Free the teacher before training.</w:t>
+        <w:t xml:space="preserve">Free the teacher before training:</w:t>
       </w:r>
       <w:r>
         <w:t xml:space="preserve"> </w:t>
@@ -35016,7 +35014,7 @@
           <w:bCs/>
           <w:b/>
         </w:rPr>
-        <w:t xml:space="preserve">Batch size 32 for SFT, 16 for DPO.</w:t>
+        <w:t xml:space="preserve">Batch size 32 for SFT, 16 for DPO:</w:t>
       </w:r>
       <w:r>
         <w:t xml:space="preserve"> </w:t>
@@ -35067,7 +35065,7 @@
           <w:bCs/>
           <w:b/>
         </w:rPr>
-        <w:t xml:space="preserve">000-token vocabulary.</w:t>
+        <w:t xml:space="preserve">000-token vocabulary:</w:t>
       </w:r>
       <w:r>
         <w:t xml:space="preserve"> </w:t>
@@ -35132,7 +35130,7 @@
           <w:bCs/>
           <w:b/>
         </w:rPr>
-        <w:t xml:space="preserve">.</w:t>
+        <w:t xml:space="preserve">:</w:t>
       </w:r>
       <w:r>
         <w:t xml:space="preserve"> </w:t>
@@ -35169,7 +35167,7 @@
           <w:bCs/>
           <w:b/>
         </w:rPr>
-        <w:t xml:space="preserve">Resumable stage markers.</w:t>
+        <w:t xml:space="preserve">Resumable stage markers:</w:t>
       </w:r>
       <w:r>
         <w:t xml:space="preserve"> </w:t>
@@ -35221,7 +35219,7 @@
           <w:bCs/>
           <w:b/>
         </w:rPr>
-        <w:t xml:space="preserve">disabled.</w:t>
+        <w:t xml:space="preserve">disabled:</w:t>
       </w:r>
       <w:r>
         <w:t xml:space="preserve"> </w:t>
@@ -36084,7 +36082,7 @@
           <w:bCs/>
           <w:b/>
         </w:rPr>
-        <w:t xml:space="preserve">Direct translation.</w:t>
+        <w:t xml:space="preserve">Direct translation:</w:t>
       </w:r>
       <w:r>
         <w:t xml:space="preserve"> </w:t>
@@ -36190,7 +36188,7 @@
           <w:bCs/>
           <w:b/>
         </w:rPr>
-        <w:t xml:space="preserve">Identical source and target.</w:t>
+        <w:t xml:space="preserve">Identical source and target:</w:t>
       </w:r>
       <w:r>
         <w:t xml:space="preserve"> </w:t>
@@ -36331,7 +36329,7 @@
           <w:bCs/>
           <w:b/>
         </w:rPr>
-        <w:t xml:space="preserve">Unknown language code.</w:t>
+        <w:t xml:space="preserve">Unknown language code:</w:t>
       </w:r>
       <w:r>
         <w:t xml:space="preserve"> </w:t>
@@ -36428,7 +36426,7 @@
           <w:bCs/>
           <w:b/>
         </w:rPr>
-        <w:t xml:space="preserve">Empty input.</w:t>
+        <w:t xml:space="preserve">Empty input:</w:t>
       </w:r>
       <w:r>
         <w:t xml:space="preserve"> </w:t>
@@ -36516,7 +36514,7 @@
           <w:bCs/>
           <w:b/>
         </w:rPr>
-        <w:t xml:space="preserve">Over-length input.</w:t>
+        <w:t xml:space="preserve">Over-length input:</w:t>
       </w:r>
       <w:r>
         <w:t xml:space="preserve"> </w:t>
@@ -36615,7 +36613,7 @@
           <w:bCs/>
           <w:b/>
         </w:rPr>
-        <w:t xml:space="preserve">Well-formed pair.</w:t>
+        <w:t xml:space="preserve">Well-formed pair:</w:t>
       </w:r>
       <w:r>
         <w:t xml:space="preserve"> </w:t>
@@ -36694,7 +36692,7 @@
           <w:bCs/>
           <w:b/>
         </w:rPr>
-        <w:t xml:space="preserve">Length-ratio filter.</w:t>
+        <w:t xml:space="preserve">Length-ratio filter:</w:t>
       </w:r>
       <w:r>
         <w:t xml:space="preserve"> </w:t>
@@ -36802,7 +36800,7 @@
           <w:bCs/>
           <w:b/>
         </w:rPr>
-        <w:t xml:space="preserve">Script-fraction filter.</w:t>
+        <w:t xml:space="preserve">Script-fraction filter:</w:t>
       </w:r>
       <w:r>
         <w:t xml:space="preserve"> </w:t>
@@ -36911,7 +36909,7 @@
           <w:bCs/>
           <w:b/>
         </w:rPr>
-        <w:t xml:space="preserve">Joiner preservation.</w:t>
+        <w:t xml:space="preserve">Joiner preservation:</w:t>
       </w:r>
       <w:r>
         <w:t xml:space="preserve"> </w:t>
@@ -36990,7 +36988,7 @@
           <w:bCs/>
           <w:b/>
         </w:rPr>
-        <w:t xml:space="preserve">Duplicate removal.</w:t>
+        <w:t xml:space="preserve">Duplicate removal:</w:t>
       </w:r>
       <w:r>
         <w:t xml:space="preserve"> </w:t>
@@ -37103,7 +37101,7 @@
           <w:bCs/>
           <w:b/>
         </w:rPr>
-        <w:t xml:space="preserve">Frozen DPO reference.</w:t>
+        <w:t xml:space="preserve">Frozen DPO reference:</w:t>
       </w:r>
       <w:r>
         <w:t xml:space="preserve"> </w:t>
@@ -37194,7 +37192,7 @@
           <w:bCs/>
           <w:b/>
         </w:rPr>
-        <w:t xml:space="preserve">Loss convergence.</w:t>
+        <w:t xml:space="preserve">Loss convergence:</w:t>
       </w:r>
       <w:r>
         <w:t xml:space="preserve"> </w:t>
@@ -37273,7 +37271,7 @@
           <w:bCs/>
           <w:b/>
         </w:rPr>
-        <w:t xml:space="preserve">Padding masked from the loss.</w:t>
+        <w:t xml:space="preserve">Padding masked from the loss:</w:t>
       </w:r>
       <w:r>
         <w:t xml:space="preserve"> </w:t>
@@ -37372,7 +37370,7 @@
           <w:bCs/>
           <w:b/>
         </w:rPr>
-        <w:t xml:space="preserve">EWC penalty at the snapshot.</w:t>
+        <w:t xml:space="preserve">EWC penalty at the snapshot:</w:t>
       </w:r>
       <w:r>
         <w:t xml:space="preserve"> </w:t>
@@ -37522,7 +37520,7 @@
           <w:bCs/>
           <w:b/>
         </w:rPr>
-        <w:t xml:space="preserve">All-in-One KD coverage.</w:t>
+        <w:t xml:space="preserve">All-in-One KD coverage:</w:t>
       </w:r>
       <w:r>
         <w:t xml:space="preserve"> </w:t>
@@ -37637,7 +37635,7 @@
           <w:bCs/>
           <w:b/>
         </w:rPr>
-        <w:t xml:space="preserve">Hindi to Bengali via English.</w:t>
+        <w:t xml:space="preserve">Hindi to Bengali via English:</w:t>
       </w:r>
       <w:r>
         <w:t xml:space="preserve"> </w:t>
@@ -37748,7 +37746,7 @@
           <w:bCs/>
           <w:b/>
         </w:rPr>
-        <w:t xml:space="preserve">Tamil to Telugu via English.</w:t>
+        <w:t xml:space="preserve">Tamil to Telugu via English:</w:t>
       </w:r>
       <w:r>
         <w:t xml:space="preserve"> </w:t>
@@ -37845,7 +37843,7 @@
           <w:bCs/>
           <w:b/>
         </w:rPr>
-        <w:t xml:space="preserve">Assamese to Bengali via English.</w:t>
+        <w:t xml:space="preserve">Assamese to Bengali via English:</w:t>
       </w:r>
       <w:r>
         <w:t xml:space="preserve"> </w:t>
@@ -37942,7 +37940,7 @@
           <w:bCs/>
           <w:b/>
         </w:rPr>
-        <w:t xml:space="preserve">Marathi to Kannada via English.</w:t>
+        <w:t xml:space="preserve">Marathi to Kannada via English:</w:t>
       </w:r>
       <w:r>
         <w:t xml:space="preserve"> </w:t>
@@ -38049,7 +38047,7 @@
           <w:bCs/>
           <w:b/>
         </w:rPr>
-        <w:t xml:space="preserve">Model discovery endpoint.</w:t>
+        <w:t xml:space="preserve">Model discovery endpoint:</w:t>
       </w:r>
       <w:r>
         <w:t xml:space="preserve"> </w:t>
@@ -38152,7 +38150,7 @@
           <w:bCs/>
           <w:b/>
         </w:rPr>
-        <w:t xml:space="preserve">Language registry endpoint.</w:t>
+        <w:t xml:space="preserve">Language registry endpoint:</w:t>
       </w:r>
       <w:r>
         <w:t xml:space="preserve"> </w:t>
@@ -38237,7 +38235,7 @@
           <w:bCs/>
           <w:b/>
         </w:rPr>
-        <w:t xml:space="preserve">Translation endpoint on a real model.</w:t>
+        <w:t xml:space="preserve">Translation endpoint on a real model:</w:t>
       </w:r>
       <w:r>
         <w:t xml:space="preserve"> </w:t>
@@ -38389,7 +38387,7 @@
           <w:bCs/>
           <w:b/>
         </w:rPr>
-        <w:t xml:space="preserve">Translation endpoint error handling.</w:t>
+        <w:t xml:space="preserve">Translation endpoint error handling:</w:t>
       </w:r>
       <w:r>
         <w:t xml:space="preserve"> </w:t>
@@ -38477,7 +38475,7 @@
           <w:bCs/>
           <w:b/>
         </w:rPr>
-        <w:t xml:space="preserve">Browser CORS preflight.</w:t>
+        <w:t xml:space="preserve">Browser CORS preflight:</w:t>
       </w:r>
       <w:r>
         <w:t xml:space="preserve"> </w:t>
@@ -38573,7 +38571,7 @@
           <w:bCs/>
           <w:b/>
         </w:rPr>
-        <w:t xml:space="preserve">Corpus to evaluation pipeline.</w:t>
+        <w:t xml:space="preserve">Corpus to evaluation pipeline:</w:t>
       </w:r>
       <w:r>
         <w:t xml:space="preserve"> </w:t>
@@ -38703,7 +38701,7 @@
           <w:bCs/>
           <w:b/>
         </w:rPr>
-        <w:t xml:space="preserve">Train, quantise and translate offline.</w:t>
+        <w:t xml:space="preserve">Train, quantise and translate offline:</w:t>
       </w:r>
       <w:r>
         <w:t xml:space="preserve"> </w:t>
@@ -38833,7 +38831,7 @@
           <w:bCs/>
           <w:b/>
         </w:rPr>
-        <w:t xml:space="preserve">Pair-agnostic pipeline.</w:t>
+        <w:t xml:space="preserve">Pair-agnostic pipeline:</w:t>
       </w:r>
       <w:r>
         <w:t xml:space="preserve"> </w:t>
@@ -38923,7 +38921,7 @@
           <w:bCs/>
           <w:b/>
         </w:rPr>
-        <w:t xml:space="preserve">CLI and REST parity.</w:t>
+        <w:t xml:space="preserve">CLI and REST parity:</w:t>
       </w:r>
       <w:r>
         <w:t xml:space="preserve"> </w:t>
@@ -39090,7 +39088,7 @@
           <w:bCs/>
           <w:b/>
         </w:rPr>
-        <w:t xml:space="preserve">Artifact size.</w:t>
+        <w:t xml:space="preserve">Artifact size:</w:t>
       </w:r>
       <w:r>
         <w:t xml:space="preserve"> </w:t>
@@ -39164,7 +39162,7 @@
           <w:bCs/>
           <w:b/>
         </w:rPr>
-        <w:t xml:space="preserve">Inference latency.</w:t>
+        <w:t xml:space="preserve">Inference latency:</w:t>
       </w:r>
       <w:r>
         <w:t xml:space="preserve"> </w:t>
@@ -39238,7 +39236,7 @@
           <w:bCs/>
           <w:b/>
         </w:rPr>
-        <w:t xml:space="preserve">Offline operation.</w:t>
+        <w:t xml:space="preserve">Offline operation:</w:t>
       </w:r>
       <w:r>
         <w:t xml:space="preserve"> </w:t>
@@ -39301,7 +39299,7 @@
           <w:bCs/>
           <w:b/>
         </w:rPr>
-        <w:t xml:space="preserve">Quality ratio.</w:t>
+        <w:t xml:space="preserve">Quality ratio:</w:t>
       </w:r>
       <w:r>
         <w:t xml:space="preserve"> </w:t>
@@ -39378,7 +39376,7 @@
           <w:bCs/>
           <w:b/>
         </w:rPr>
-        <w:t xml:space="preserve">Model health across all directions.</w:t>
+        <w:t xml:space="preserve">Model health across all directions:</w:t>
       </w:r>
       <w:r>
         <w:t xml:space="preserve"> </w:t>
@@ -39441,7 +39439,7 @@
           <w:bCs/>
           <w:b/>
         </w:rPr>
-        <w:t xml:space="preserve">Coverage.</w:t>
+        <w:t xml:space="preserve">Coverage:</w:t>
       </w:r>
       <w:r>
         <w:t xml:space="preserve"> </w:t>
@@ -39588,7 +39586,7 @@
           <w:bCs/>
           <w:b/>
         </w:rPr>
-        <w:t xml:space="preserve">Padding counted in the training loss.</w:t>
+        <w:t xml:space="preserve">Padding counted in the training loss:</w:t>
       </w:r>
       <w:r>
         <w:t xml:space="preserve"> </w:t>
@@ -39635,7 +39633,7 @@
           <w:bCs/>
           <w:b/>
         </w:rPr>
-        <w:t xml:space="preserve">Leading BOS added to labels.</w:t>
+        <w:t xml:space="preserve">Leading BOS added to labels:</w:t>
       </w:r>
       <w:r>
         <w:t xml:space="preserve"> </w:t>
@@ -39682,7 +39680,7 @@
           <w:bCs/>
           <w:b/>
         </w:rPr>
-        <w:t xml:space="preserve">Learning-rate warmup silently ignored.</w:t>
+        <w:t xml:space="preserve">Learning-rate warmup silently ignored:</w:t>
       </w:r>
       <w:r>
         <w:t xml:space="preserve"> </w:t>
@@ -39729,7 +39727,7 @@
           <w:bCs/>
           <w:b/>
         </w:rPr>
-        <w:t xml:space="preserve">Missing gradient clipping.</w:t>
+        <w:t xml:space="preserve">Missing gradient clipping:</w:t>
       </w:r>
       <w:r>
         <w:t xml:space="preserve"> </w:t>
@@ -39776,7 +39774,7 @@
           <w:bCs/>
           <w:b/>
         </w:rPr>
-        <w:t xml:space="preserve">Positional-embedding overflow.</w:t>
+        <w:t xml:space="preserve">Positional-embedding overflow:</w:t>
       </w:r>
       <w:r>
         <w:t xml:space="preserve"> </w:t>
@@ -39823,7 +39821,7 @@
           <w:bCs/>
           <w:b/>
         </w:rPr>
-        <w:t xml:space="preserve">CLI ignored the requested language pair.</w:t>
+        <w:t xml:space="preserve">CLI ignored the requested language pair:</w:t>
       </w:r>
       <w:r>
         <w:t xml:space="preserve"> </w:t>
@@ -39870,7 +39868,7 @@
           <w:bCs/>
           <w:b/>
         </w:rPr>
-        <w:t xml:space="preserve">Teacher post-processing deadlock.</w:t>
+        <w:t xml:space="preserve">Teacher post-processing deadlock:</w:t>
       </w:r>
       <w:r>
         <w:t xml:space="preserve"> </w:t>
@@ -39991,7 +39989,7 @@
           <w:bCs/>
           <w:b/>
         </w:rPr>
-        <w:t xml:space="preserve">package).</w:t>
+        <w:t xml:space="preserve">package):</w:t>
       </w:r>
       <w:r>
         <w:t xml:space="preserve"> </w:t>
@@ -40047,7 +40045,7 @@
           <w:bCs/>
           <w:b/>
         </w:rPr>
-        <w:t xml:space="preserve">Missing checkpoint treated as a remote identifier.</w:t>
+        <w:t xml:space="preserve">Missing checkpoint treated as a remote identifier:</w:t>
       </w:r>
       <w:r>
         <w:t xml:space="preserve"> </w:t>
@@ -40094,7 +40092,7 @@
           <w:bCs/>
           <w:b/>
         </w:rPr>
-        <w:t xml:space="preserve">Stub and real engines leaked state between tests.</w:t>
+        <w:t xml:space="preserve">Stub and real engines leaked state between tests:</w:t>
       </w:r>
       <w:r>
         <w:t xml:space="preserve"> </w:t>
@@ -40682,7 +40680,7 @@
           <w:bCs/>
           <w:b/>
         </w:rPr>
-        <w:t xml:space="preserve">Naive baseline (S0).</w:t>
+        <w:t xml:space="preserve">Naive baseline (S0):</w:t>
       </w:r>
       <w:r>
         <w:t xml:space="preserve"> </w:t>
@@ -40703,7 +40701,7 @@
           <w:bCs/>
           <w:b/>
         </w:rPr>
-        <w:t xml:space="preserve">Sequence-level distillation (S1).</w:t>
+        <w:t xml:space="preserve">Sequence-level distillation (S1):</w:t>
       </w:r>
       <w:r>
         <w:t xml:space="preserve"> </w:t>
@@ -40724,7 +40722,7 @@
           <w:bCs/>
           <w:b/>
         </w:rPr>
-        <w:t xml:space="preserve">Preference distillation (S2).</w:t>
+        <w:t xml:space="preserve">Preference distillation (S2):</w:t>
       </w:r>
       <w:r>
         <w:t xml:space="preserve"> </w:t>
@@ -40745,7 +40743,7 @@
           <w:bCs/>
           <w:b/>
         </w:rPr>
-        <w:t xml:space="preserve">Distillation then DPO (S3).</w:t>
+        <w:t xml:space="preserve">Distillation then DPO (S3):</w:t>
       </w:r>
       <w:r>
         <w:t xml:space="preserve"> </w:t>
@@ -41526,7 +41524,7 @@
           <w:bCs/>
           <w:b/>
         </w:rPr>
-        <w:t xml:space="preserve">#1, out of memory.</w:t>
+        <w:t xml:space="preserve">#1, out of memory:</w:t>
       </w:r>
       <w:r>
         <w:t xml:space="preserve"> </w:t>
@@ -41573,7 +41571,7 @@
           <w:bCs/>
           <w:b/>
         </w:rPr>
-        <w:t xml:space="preserve">#1b, empty output.</w:t>
+        <w:t xml:space="preserve">#1b, empty output:</w:t>
       </w:r>
       <w:r>
         <w:t xml:space="preserve"> </w:t>
@@ -41626,7 +41624,7 @@
           <w:bCs/>
           <w:b/>
         </w:rPr>
-        <w:t xml:space="preserve">#2, source-agnostic output.</w:t>
+        <w:t xml:space="preserve">#2, source-agnostic output:</w:t>
       </w:r>
       <w:r>
         <w:t xml:space="preserve"> </w:t>
@@ -41746,7 +41744,7 @@
           <w:bCs/>
           <w:b/>
         </w:rPr>
-        <w:t xml:space="preserve">.</w:t>
+        <w:t xml:space="preserve">:</w:t>
       </w:r>
       <w:r>
         <w:t xml:space="preserve"> </w:t>
@@ -41799,7 +41797,7 @@
           <w:bCs/>
           <w:b/>
         </w:rPr>
-        <w:t xml:space="preserve">#4, collapse.</w:t>
+        <w:t xml:space="preserve">#4, collapse:</w:t>
       </w:r>
       <w:r>
         <w:t xml:space="preserve"> </w:t>
@@ -41888,7 +41886,7 @@
           <w:bCs/>
           <w:b/>
         </w:rPr>
-        <w:t xml:space="preserve">#5, stable.</w:t>
+        <w:t xml:space="preserve">#5, stable:</w:t>
       </w:r>
       <w:r>
         <w:t xml:space="preserve"> </w:t>
@@ -41935,7 +41933,7 @@
           <w:bCs/>
           <w:b/>
         </w:rPr>
-        <w:t xml:space="preserve">#6, plateau.</w:t>
+        <w:t xml:space="preserve">#6, plateau:</w:t>
       </w:r>
       <w:r>
         <w:t xml:space="preserve"> </w:t>
@@ -42105,7 +42103,7 @@
           <w:bCs/>
           <w:b/>
         </w:rPr>
-        <w:t xml:space="preserve">English.</w:t>
+        <w:t xml:space="preserve">English:</w:t>
       </w:r>
       <w:r>
         <w:t xml:space="preserve"> </w:t>
@@ -42230,7 +42228,7 @@
           <w:bCs/>
           <w:b/>
         </w:rPr>
-        <w:t xml:space="preserve">English.</w:t>
+        <w:t xml:space="preserve">English:</w:t>
       </w:r>
       <w:r>
         <w:t xml:space="preserve"> </w:t>
@@ -42355,7 +42353,7 @@
           <w:bCs/>
           <w:b/>
         </w:rPr>
-        <w:t xml:space="preserve">Malayalam.</w:t>
+        <w:t xml:space="preserve">Malayalam:</w:t>
       </w:r>
       <w:r>
         <w:t xml:space="preserve"> </w:t>
@@ -42696,7 +42694,7 @@
           <w:bCs/>
           <w:b/>
         </w:rPr>
-        <w:t xml:space="preserve">.</w:t>
+        <w:t xml:space="preserve">:</w:t>
       </w:r>
       <w:r>
         <w:t xml:space="preserve"> </w:t>
@@ -42720,7 +42718,7 @@
           <w:bCs/>
           <w:b/>
         </w:rPr>
-        <w:t xml:space="preserve">Training loss is a reliable collapse indicator.</w:t>
+        <w:t xml:space="preserve">Training loss is a reliable collapse indicator:</w:t>
       </w:r>
       <w:r>
         <w:t xml:space="preserve"> </w:t>
@@ -43263,7 +43261,7 @@
           <w:bCs/>
           <w:b/>
         </w:rPr>
-        <w:t xml:space="preserve">Direction symmetry holds.</w:t>
+        <w:t xml:space="preserve">Direction symmetry holds:</w:t>
       </w:r>
       <w:r>
         <w:t xml:space="preserve"> </w:t>
@@ -43321,7 +43319,7 @@
           <w:bCs/>
           <w:b/>
         </w:rPr>
-        <w:t xml:space="preserve">The near-misses are under-converged, not unstable.</w:t>
+        <w:t xml:space="preserve">The near-misses are under-converged, not unstable:</w:t>
       </w:r>
       <w:r>
         <w:t xml:space="preserve"> </w:t>
@@ -43369,7 +43367,7 @@
           <w:bCs/>
           <w:b/>
         </w:rPr>
-        <w:t xml:space="preserve">BLEU understates agglutinative languages.</w:t>
+        <w:t xml:space="preserve">BLEU understates agglutinative languages:</w:t>
       </w:r>
       <w:r>
         <w:t xml:space="preserve"> </w:t>
@@ -43618,7 +43616,7 @@
           <w:bCs/>
           <w:b/>
         </w:rPr>
-        <w:t xml:space="preserve">Quality.</w:t>
+        <w:t xml:space="preserve">Quality:</w:t>
       </w:r>
       <w:r>
         <w:t xml:space="preserve"> </w:t>
@@ -43682,7 +43680,7 @@
           <w:bCs/>
           <w:b/>
         </w:rPr>
-        <w:t xml:space="preserve">Latency.</w:t>
+        <w:t xml:space="preserve">Latency:</w:t>
       </w:r>
       <w:r>
         <w:t xml:space="preserve"> </w:t>
@@ -43746,7 +43744,7 @@
           <w:bCs/>
           <w:b/>
         </w:rPr>
-        <w:t xml:space="preserve">Size.</w:t>
+        <w:t xml:space="preserve">Size:</w:t>
       </w:r>
       <w:r>
         <w:t xml:space="preserve"> </w:t>
@@ -43810,7 +43808,7 @@
           <w:bCs/>
           <w:b/>
         </w:rPr>
-        <w:t xml:space="preserve">Offline.</w:t>
+        <w:t xml:space="preserve">Offline:</w:t>
       </w:r>
       <w:r>
         <w:t xml:space="preserve"> </w:t>
@@ -43953,7 +43951,7 @@
           <w:bCs/>
           <w:b/>
         </w:rPr>
-        <w:t xml:space="preserve">en.</w:t>
+        <w:t xml:space="preserve">en:</w:t>
       </w:r>
       <w:r>
         <w:t xml:space="preserve"> </w:t>
@@ -44020,7 +44018,7 @@
           <w:bCs/>
           <w:b/>
         </w:rPr>
-        <w:t xml:space="preserve">en.</w:t>
+        <w:t xml:space="preserve">en:</w:t>
       </w:r>
       <w:r>
         <w:t xml:space="preserve"> </w:t>
@@ -44087,7 +44085,7 @@
           <w:bCs/>
           <w:b/>
         </w:rPr>
-        <w:t xml:space="preserve">en.</w:t>
+        <w:t xml:space="preserve">en:</w:t>
       </w:r>
       <w:r>
         <w:t xml:space="preserve"> </w:t>
@@ -44154,7 +44152,7 @@
           <w:bCs/>
           <w:b/>
         </w:rPr>
-        <w:t xml:space="preserve">hi.</w:t>
+        <w:t xml:space="preserve">hi:</w:t>
       </w:r>
       <w:r>
         <w:t xml:space="preserve"> </w:t>
@@ -44221,7 +44219,7 @@
           <w:bCs/>
           <w:b/>
         </w:rPr>
-        <w:t xml:space="preserve">hi.</w:t>
+        <w:t xml:space="preserve">hi:</w:t>
       </w:r>
       <w:r>
         <w:t xml:space="preserve"> </w:t>
@@ -44288,7 +44286,7 @@
           <w:bCs/>
           <w:b/>
         </w:rPr>
-        <w:t xml:space="preserve">en.</w:t>
+        <w:t xml:space="preserve">en:</w:t>
       </w:r>
       <w:r>
         <w:t xml:space="preserve"> </w:t>
@@ -44355,7 +44353,7 @@
           <w:bCs/>
           <w:b/>
         </w:rPr>
-        <w:t xml:space="preserve">en.</w:t>
+        <w:t xml:space="preserve">en:</w:t>
       </w:r>
       <w:r>
         <w:t xml:space="preserve"> </w:t>
@@ -44422,7 +44420,7 @@
           <w:bCs/>
           <w:b/>
         </w:rPr>
-        <w:t xml:space="preserve">en.</w:t>
+        <w:t xml:space="preserve">en:</w:t>
       </w:r>
       <w:r>
         <w:t xml:space="preserve"> </w:t>
@@ -44489,7 +44487,7 @@
           <w:bCs/>
           <w:b/>
         </w:rPr>
-        <w:t xml:space="preserve">en.</w:t>
+        <w:t xml:space="preserve">en:</w:t>
       </w:r>
       <w:r>
         <w:t xml:space="preserve"> </w:t>
@@ -44556,7 +44554,7 @@
           <w:bCs/>
           <w:b/>
         </w:rPr>
-        <w:t xml:space="preserve">ml.</w:t>
+        <w:t xml:space="preserve">ml:</w:t>
       </w:r>
       <w:r>
         <w:t xml:space="preserve"> </w:t>
@@ -45089,7 +45087,7 @@
           <w:bCs/>
           <w:b/>
         </w:rPr>
-        <w:t xml:space="preserve">Repetition.</w:t>
+        <w:t xml:space="preserve">Repetition:</w:t>
       </w:r>
       <w:r>
         <w:t xml:space="preserve"> </w:t>
@@ -45202,7 +45200,7 @@
           <w:bCs/>
           <w:b/>
         </w:rPr>
-        <w:t xml:space="preserve">Untranslated idiom.</w:t>
+        <w:t xml:space="preserve">Untranslated idiom:</w:t>
       </w:r>
       <w:r>
         <w:t xml:space="preserve"> </w:t>
@@ -45273,7 +45271,7 @@
           <w:bCs/>
           <w:b/>
         </w:rPr>
-        <w:t xml:space="preserve">Lexical slip.</w:t>
+        <w:t xml:space="preserve">Lexical slip:</w:t>
       </w:r>
       <w:r>
         <w:t xml:space="preserve"> </w:t>
@@ -45395,7 +45393,7 @@
           <w:bCs/>
           <w:b/>
         </w:rPr>
-        <w:t xml:space="preserve">Dropped modifier.</w:t>
+        <w:t xml:space="preserve">Dropped modifier:</w:t>
       </w:r>
       <w:r>
         <w:t xml:space="preserve"> </w:t>
@@ -46810,7 +46808,7 @@
           <w:bCs/>
           <w:b/>
         </w:rPr>
-        <w:t xml:space="preserve">.</w:t>
+        <w:t xml:space="preserve">:</w:t>
       </w:r>
       <w:r>
         <w:t xml:space="preserve"> </w:t>
@@ -46866,7 +46864,7 @@
           <w:bCs/>
           <w:b/>
         </w:rPr>
-        <w:t xml:space="preserve"> ms.</w:t>
+        <w:t xml:space="preserve"> ms:</w:t>
       </w:r>
       <w:r>
         <w:t xml:space="preserve"> </w:t>
@@ -46922,7 +46920,7 @@
           <w:bCs/>
           <w:b/>
         </w:rPr>
-        <w:t xml:space="preserve"> MB.</w:t>
+        <w:t xml:space="preserve"> MB:</w:t>
       </w:r>
       <w:r>
         <w:t xml:space="preserve"> </w:t>
@@ -46953,7 +46951,7 @@
           <w:bCs/>
           <w:b/>
         </w:rPr>
-        <w:t xml:space="preserve">Fully offline.</w:t>
+        <w:t xml:space="preserve">Fully offline:</w:t>
       </w:r>
       <w:r>
         <w:t xml:space="preserve"> </w:t>
@@ -46984,7 +46982,7 @@
           <w:bCs/>
           <w:b/>
         </w:rPr>
-        <w:t xml:space="preserve">Test the distillation hypothesis.</w:t>
+        <w:t xml:space="preserve">Test the distillation hypothesis:</w:t>
       </w:r>
       <w:r>
         <w:t xml:space="preserve"> </w:t>
@@ -47015,7 +47013,7 @@
           <w:bCs/>
           <w:b/>
         </w:rPr>
-        <w:t xml:space="preserve">Coverage and extensibility.</w:t>
+        <w:t xml:space="preserve">Coverage and extensibility:</w:t>
       </w:r>
       <w:r>
         <w:t xml:space="preserve"> </w:t>
@@ -47065,7 +47063,7 @@
           <w:bCs/>
           <w:b/>
         </w:rPr>
-        <w:t xml:space="preserve">hypothesis.</w:t>
+        <w:t xml:space="preserve">hypothesis:</w:t>
       </w:r>
       <w:r>
         <w:t xml:space="preserve"> </w:t>
@@ -47155,7 +47153,7 @@
           <w:bCs/>
           <w:b/>
         </w:rPr>
-        <w:t xml:space="preserve">A working offline system, not a prototype.</w:t>
+        <w:t xml:space="preserve">A working offline system, not a prototype:</w:t>
       </w:r>
       <w:r>
         <w:t xml:space="preserve"> </w:t>
@@ -47197,7 +47195,7 @@
           <w:bCs/>
           <w:b/>
         </w:rPr>
-        <w:t xml:space="preserve">Quadratic coverage from linear storage.</w:t>
+        <w:t xml:space="preserve">Quadratic coverage from linear storage:</w:t>
       </w:r>
       <w:r>
         <w:t xml:space="preserve"> </w:t>
@@ -47239,7 +47237,7 @@
           <w:bCs/>
           <w:b/>
         </w:rPr>
-        <w:t xml:space="preserve">A reproducible engineering record.</w:t>
+        <w:t xml:space="preserve">A reproducible engineering record:</w:t>
       </w:r>
       <w:r>
         <w:t xml:space="preserve"> </w:t>
@@ -47324,19 +47322,19 @@
           <w:bCs/>
           <w:b/>
         </w:rPr>
-        <w:t xml:space="preserve">Eight directions fall short of the quality target,</w:t>
-      </w:r>
-      <w:r>
-        <w:t xml:space="preserve"> </w:t>
-      </w:r>
-      <w:r>
-        <w:t xml:space="preserve">at ratios</w:t>
-      </w:r>
-      <w:r>
-        <w:t xml:space="preserve"> </w:t>
-      </w:r>
-      <w:r>
-        <w:t xml:space="preserve">between 0.755 and 0.787. Their supervised losses cluster at 2.00 to 2.32, the</w:t>
+        <w:t xml:space="preserve">Eight directions fall short of the quality target:</w:t>
+      </w:r>
+      <w:r>
+        <w:t xml:space="preserve"> </w:t>
+      </w:r>
+      <w:r>
+        <w:t xml:space="preserve">they sit at</w:t>
+      </w:r>
+      <w:r>
+        <w:t xml:space="preserve"> </w:t>
+      </w:r>
+      <w:r>
+        <w:t xml:space="preserve">ratios between 0.755 and 0.787. Their supervised losses cluster at 2.00 to 2.32, the</w:t>
       </w:r>
       <w:r>
         <w:t xml:space="preserve"> </w:t>
@@ -47363,7 +47361,7 @@
           <w:bCs/>
           <w:b/>
         </w:rPr>
-        <w:t xml:space="preserve">The teacher caps the ceiling.</w:t>
+        <w:t xml:space="preserve">The teacher caps the ceiling:</w:t>
       </w:r>
       <w:r>
         <w:t xml:space="preserve"> </w:t>
@@ -47408,7 +47406,7 @@
           <w:bCs/>
           <w:b/>
         </w:rPr>
-        <w:t xml:space="preserve">The reported ratios are not benchmark numbers.</w:t>
+        <w:t xml:space="preserve">The reported ratios are not benchmark numbers:</w:t>
       </w:r>
       <w:r>
         <w:t xml:space="preserve"> </w:t>
@@ -47487,7 +47485,7 @@
           <w:bCs/>
           <w:b/>
         </w:rPr>
-        <w:t xml:space="preserve">ARM latency is projected, not measured.</w:t>
+        <w:t xml:space="preserve">ARM latency is projected, not measured:</w:t>
       </w:r>
       <w:r>
         <w:t xml:space="preserve"> </w:t>
@@ -47531,7 +47529,7 @@
           <w:bCs/>
           <w:b/>
         </w:rPr>
-        <w:t xml:space="preserve">Rural healthcare.</w:t>
+        <w:t xml:space="preserve">Rural healthcare:</w:t>
       </w:r>
       <w:r>
         <w:t xml:space="preserve"> </w:t>
@@ -47567,7 +47565,7 @@
           <w:bCs/>
           <w:b/>
         </w:rPr>
-        <w:t xml:space="preserve">Defence and border operations.</w:t>
+        <w:t xml:space="preserve">Defence and border operations:</w:t>
       </w:r>
       <w:r>
         <w:t xml:space="preserve"> </w:t>
@@ -47603,7 +47601,7 @@
           <w:bCs/>
           <w:b/>
         </w:rPr>
-        <w:t xml:space="preserve">Education.</w:t>
+        <w:t xml:space="preserve">Education:</w:t>
       </w:r>
       <w:r>
         <w:t xml:space="preserve"> </w:t>
@@ -47633,7 +47631,7 @@
           <w:bCs/>
           <w:b/>
         </w:rPr>
-        <w:t xml:space="preserve">Government service delivery.</w:t>
+        <w:t xml:space="preserve">Government service delivery:</w:t>
       </w:r>
       <w:r>
         <w:t xml:space="preserve"> </w:t>
@@ -47663,7 +47661,7 @@
           <w:bCs/>
           <w:b/>
         </w:rPr>
-        <w:t xml:space="preserve">Disaster relief.</w:t>
+        <w:t xml:space="preserve">Disaster relief:</w:t>
       </w:r>
       <w:r>
         <w:t xml:space="preserve"> </w:t>
@@ -47693,7 +47691,7 @@
           <w:bCs/>
           <w:b/>
         </w:rPr>
-        <w:t xml:space="preserve">Privacy-sensitive documents.</w:t>
+        <w:t xml:space="preserve">Privacy-sensitive documents:</w:t>
       </w:r>
       <w:r>
         <w:t xml:space="preserve"> </w:t>
@@ -47723,7 +47721,7 @@
           <w:bCs/>
           <w:b/>
         </w:rPr>
-        <w:t xml:space="preserve">As a research artifact.</w:t>
+        <w:t xml:space="preserve">As a research artifact:</w:t>
       </w:r>
       <w:r>
         <w:t xml:space="preserve"> </w:t>
@@ -49850,7 +49848,7 @@
           <w:bCs/>
           <w:b/>
         </w:rPr>
-        <w:t xml:space="preserve">Teacher (IndicTrans2 distilled-200M).</w:t>
+        <w:t xml:space="preserve">Teacher (IndicTrans2 distilled-200M):</w:t>
       </w:r>
       <w:r>
         <w:t xml:space="preserve"> </w:t>
@@ -49871,7 +49869,7 @@
           <w:bCs/>
           <w:b/>
         </w:rPr>
-        <w:t xml:space="preserve">Naive baseline (S0).</w:t>
+        <w:t xml:space="preserve">Naive baseline (S0):</w:t>
       </w:r>
       <w:r>
         <w:t xml:space="preserve"> </w:t>
@@ -49892,7 +49890,7 @@
           <w:bCs/>
           <w:b/>
         </w:rPr>
-        <w:t xml:space="preserve">Sequence-level distillation (S1).</w:t>
+        <w:t xml:space="preserve">Sequence-level distillation (S1):</w:t>
       </w:r>
       <w:r>
         <w:t xml:space="preserve"> </w:t>
@@ -49952,7 +49950,7 @@
           <w:bCs/>
           <w:b/>
         </w:rPr>
-        <w:t xml:space="preserve">Preference distillation (S2).</w:t>
+        <w:t xml:space="preserve">Preference distillation (S2):</w:t>
       </w:r>
       <w:r>
         <w:t xml:space="preserve"> </w:t>
@@ -49973,7 +49971,7 @@
           <w:bCs/>
           <w:b/>
         </w:rPr>
-        <w:t xml:space="preserve">Distillation then DPO (S3).</w:t>
+        <w:t xml:space="preserve">Distillation then DPO (S3):</w:t>
       </w:r>
       <w:r>
         <w:t xml:space="preserve"> </w:t>
@@ -50034,7 +50032,7 @@
           <w:bCs/>
           <w:b/>
         </w:rPr>
-        <w:t xml:space="preserve">FP32 ONNX.</w:t>
+        <w:t xml:space="preserve">FP32 ONNX:</w:t>
       </w:r>
       <w:r>
         <w:t xml:space="preserve"> </w:t>
@@ -50055,7 +50053,7 @@
           <w:bCs/>
           <w:b/>
         </w:rPr>
-        <w:t xml:space="preserve">INT8.</w:t>
+        <w:t xml:space="preserve">INT8:</w:t>
       </w:r>
       <w:r>
         <w:t xml:space="preserve"> </w:t>
@@ -50076,7 +50074,7 @@
           <w:bCs/>
           <w:b/>
         </w:rPr>
-        <w:t xml:space="preserve">INT4.</w:t>
+        <w:t xml:space="preserve">INT4:</w:t>
       </w:r>
       <w:r>
         <w:t xml:space="preserve"> </w:t>
@@ -53255,7 +53253,34 @@
     <w:abstractNumId w:val="991"/>
   </w:num>
   <w:num w:numId="1042">
-    <w:abstractNumId w:val="991"/>
+    <w:abstractNumId w:val="99201"/>
+    <w:lvlOverride w:ilvl="0">
+      <w:startOverride w:val="1"/>
+    </w:lvlOverride>
+    <w:lvlOverride w:ilvl="1">
+      <w:startOverride w:val="1"/>
+    </w:lvlOverride>
+    <w:lvlOverride w:ilvl="2">
+      <w:startOverride w:val="1"/>
+    </w:lvlOverride>
+    <w:lvlOverride w:ilvl="3">
+      <w:startOverride w:val="1"/>
+    </w:lvlOverride>
+    <w:lvlOverride w:ilvl="4">
+      <w:startOverride w:val="1"/>
+    </w:lvlOverride>
+    <w:lvlOverride w:ilvl="5">
+      <w:startOverride w:val="1"/>
+    </w:lvlOverride>
+    <w:lvlOverride w:ilvl="6">
+      <w:startOverride w:val="1"/>
+    </w:lvlOverride>
+    <w:lvlOverride w:ilvl="7">
+      <w:startOverride w:val="1"/>
+    </w:lvlOverride>
+    <w:lvlOverride w:ilvl="8">
+      <w:startOverride w:val="1"/>
+    </w:lvlOverride>
   </w:num>
   <w:num w:numId="1043">
     <w:abstractNumId w:val="991"/>

</xml_diff>